<commit_message>
court(haw): reply brief gated on latex (notes kept whole now), docx reported for the note LibreOffice sets apart from its line (fb-595.54.20)
Co-Authored-By: Claude Opus 5.5 <noreply@anthropic.com>
</commit_message>
<xml_diff>
--- a/courts/ninth-circuit/hawaii/state/supreme-court/reply-brief/usage/OUTPUT-reply-brief.docx
+++ b/courts/ninth-circuit/hawaii/state/supreme-court/reply-brief/usage/OUTPUT-reply-brief.docx
@@ -2720,13 +2720,7 @@
         <w:pStyle w:val="BodyText"/>
       </w:pPr>
       <w:r>
-        <w:t xml:space="preserve">Tax-Appellant/​Appellee COUNTY OF MAUI submits its Reply Appellate Brief pursuant to Haw. Rev. Stat. § 641</w:t>
-      </w:r>
-      <w:r>
-        <w:noBreakHyphen/>
-      </w:r>
-      <w:r>
-        <w:t xml:space="preserve">1(a) and Hawai’i Rules of Appellate Procedure, Rule 4.1.</w:t>
+        <w:t xml:space="preserve">Tax-Appellant/​Appellee COUNTY OF MAUI submits its Reply Appellate Brief pursuant to Haw. Rev. Stat. § 641-⁠1(a) and Hawai’i Rules of Appellate Procedure, Rule 4.1.</w:t>
       </w:r>
     </w:p>
     <w:p>
@@ -3877,7 +3871,7 @@
         <w:pStyle w:val="XdQuoteOnly"/>
       </w:pPr>
       <w:r>
-        <w:t xml:space="preserve">In 1980, article VII, section 2 (sic) transferred all property tax functions to the counties. See Comm. of the Whole Rep. No. 7, in 1 Proceedings of the Constitutional Convention of Hawai’i of 1978, at 1008 (1980). HRS § 246A–2 thereafter reaffirmed that transfer, effective July 1, 1981. See HRS § 246A–2. Neither provision limited or restricted the counties’ taxing authority. The constitutional and legislative acts covered the whole subject of property taxation power and embraced the entire law in that regard.</w:t>
+        <w:t xml:space="preserve">In 1980, article VII, section 2 (sic) transferred all property tax functions to the counties. See Comm. of the Whole Rep. No. 7, in 1 Proceedings of the Constitutional Convention of Hawai’i of 1978, at 1008 (1980). HRS § 246A–⁠2 thereafter reaffirmed that transfer, effective July 1, 1981. See HRS § 246A–⁠2. Neither provision limited or restricted the counties’ taxing authority. The constitutional and legislative acts covered the whole subject of property taxation power and embraced the entire law in that regard.</w:t>
       </w:r>
     </w:p>
     <w:p>
@@ -4082,7 +4076,7 @@
         <w:t xml:space="preserve"> </w:t>
       </w:r>
       <w:r>
-        <w:t xml:space="preserve">“wind energy conversion property . . . , including . . . windmill, wind turbine, [and] tower,”</w:t>
+        <w:t xml:space="preserve">“wind energy conversion property . . . , including . . . windmill, wind turbine, [and] tower,”</w:t>
       </w:r>
       <w:r>
         <w:t xml:space="preserve"> </w:t>
@@ -5557,7 +5551,7 @@
         <w:pStyle w:val="BodyText"/>
       </w:pPr>
       <w:r>
-        <w:t xml:space="preserve">Likewise, there is nothing in Hawai’i Revised Statutes § 246-l which appears to codify any de jure common law distinction of personal property as reserved for taxation by the state. The County’s Opening Appellate Brief has already expressly addressed this point. See, CAAP 17</w:t>
+        <w:t xml:space="preserve">Likewise, there is nothing in Hawai’i Revised Statutes § 246-⁠l which appears to codify any de jure common law distinction of personal property as reserved for taxation by the state. The County’s Opening Appellate Brief has already expressly addressed this point. See, CAAP 17</w:t>
       </w:r>
       <w:r>
         <w:noBreakHyphen/>
@@ -5581,7 +5575,7 @@
         <w:noBreakHyphen/>
       </w:r>
       <w:r>
-        <w:t xml:space="preserve">18 of its Answering Brief that the legislative intent of HRS § 246-l [am L 1967, c 120, § 1] to distinguish personal property from real property can be inferred from the Tax Appeal Court’s and Intermediate Court of Appeal’s interpretation of the MCC § 3.48.005 in 2014 is truly bizarre logic, and bootstrapping. See, CAAP 17</w:t>
+        <w:t xml:space="preserve">18 of its Answering Brief that the legislative intent of HRS § 246-⁠l [am L 1967, c 120, § 1] to distinguish personal property from real property can be inferred from the Tax Appeal Court’s and Intermediate Court of Appeal’s interpretation of the MCC § 3.48.005 in 2014 is truly bizarre logic, and bootstrapping. See, CAAP 17</w:t>
       </w:r>
       <w:r>
         <w:noBreakHyphen/>
@@ -5599,7 +5593,7 @@
         <w:noBreakHyphen/>
       </w:r>
       <w:r>
-        <w:t xml:space="preserve">27. It is equally unclear how the similarity in language between HRS § 246-l and MCC § 3.48.00 reflects a reservation to the state of any authority to tax personal property.</w:t>
+        <w:t xml:space="preserve">27. It is equally unclear how the similarity in language between HRS § 246-⁠l and MCC § 3.48.00 reflects a reservation to the state of any authority to tax personal property.</w:t>
       </w:r>
     </w:p>
     <w:p>
@@ -7373,7 +7367,7 @@
         <w:t xml:space="preserve"> </w:t>
       </w:r>
       <w:r>
-        <w:t xml:space="preserve">of the State of Hawaii. HRS § 602–4. Concomitantly, we have been endowed with authority</w:t>
+        <w:t xml:space="preserve">of the State of Hawaii. HRS § 602–⁠4. Concomitantly, we have been endowed with authority</w:t>
       </w:r>
       <w:r>
         <w:t xml:space="preserve"> </w:t>
@@ -7439,7 +7433,7 @@
         <w:pStyle w:val="XdQuoteLast"/>
       </w:pPr>
       <w:r>
-        <w:t xml:space="preserve">(1) To hear and determine all questions of law, or of mixed law and fact, which are properly brought before it . . . . by transfer as provided in this chapter[.]”</w:t>
+        <w:t xml:space="preserve">(1) To hear and determine all questions of law, or of mixed law and fact, which are properly brought before it . . . . by transfer as provided in this chapter[.]”</w:t>
       </w:r>
     </w:p>
     <w:p>
@@ -8940,7 +8934,7 @@
         <w:t xml:space="preserve"> </w:t>
       </w:r>
       <w:r>
-        <w:t xml:space="preserve">See, People of State of New York v. Weaver, 100 U.S. 539, 545, 25 L. Ed. 705 (1879) (“An assessment, strictly speaking, is an official estimate of the sums which are to constitute the basis of an apportionment of a tax between the individual subjects of taxation within the district. As the word is more commonly employed, an assessment consists in the two processes listing the persons, property, . . . to be taxed, and of estimating the sums which are to be the guide in an apportionment of the tax between them. . . . Taxation by valuation cannot be apportioned without it.’) (citing Cooley, Taxation, 258, 259; Burroughs, Taxation, p. 198, sect. 94.); see also, Cty. of Westchester v. Town of Harrison, 201 Misc. 211, 114 N.Y.S.2d 492 (Sup. Ct. 1951) (Assessors have duty to fix fair and full market value on realty and, if it is exempt, to so assess it, to fix fair and full value of that portion of realty located in various taxing districts, and to indicate that such portions are liable for the special district taxes.); see also, Everett v. Adamson, 106 Wash. 355, 357, 180 P. 144, 145 (1919) (“The power to levy special assessments for public improvements, according to the benefits, is delegated to the local authorities, but is wholly derived from the sovereign taxing power, and could assuredly be exercised in the first instance by it.</w:t>
+        <w:t xml:space="preserve">See, People of State of New York v. Weaver, 100 U.S. 539, 545, 25 L. Ed. 705 (1879) (“An assessment, strictly speaking, is an official estimate of the sums which are to constitute the basis of an apportionment of a tax between the individual subjects of taxation within the district. As the word is more commonly employed, an assessment consists in the two processes listing the persons, property, . . . to be taxed, and of estimating the sums which are to be the guide in an apportionment of the tax between them. . . . Taxation by valuation cannot be apportioned without it.’) (citing Cooley, Taxation, 258, 259; Burroughs, Taxation, p. 198, sect. 94.); see also, Cty. of Westchester v. Town of Harrison, 201 Misc. 211, 114 N.Y.S.2d 492 (Sup. Ct. 1951) (Assessors have duty to fix fair and full market value on realty and, if it is exempt, to so assess it, to fix fair and full value of that portion of realty located in various taxing districts, and to indicate that such portions are liable for the special district taxes.); see also, Everett v. Adamson, 106 Wash. 355, 357, 180 P. 144, 145 (1919) (“The power to levy special assessments for public improvements, according to the benefits, is delegated to the local authorities, but is wholly derived from the sovereign taxing power, and could assuredly be exercised in the first instance by it.</w:t>
       </w:r>
     </w:p>
   </w:footnote>
@@ -9282,19 +9276,7 @@
         <w:t xml:space="preserve"> </w:t>
       </w:r>
       <w:r>
-        <w:t xml:space="preserve">As to HRS § 235</w:t>
-      </w:r>
-      <w:r>
-        <w:noBreakHyphen/>
-      </w:r>
-      <w:r>
-        <w:t xml:space="preserve">110.7, the provisions apparently relate to any capital goods at the time of purchase and/​or import into the State, a transaction triggering a GET tax obligation. Haw. Rev. Stat. § 235</w:t>
-      </w:r>
-      <w:r>
-        <w:noBreakHyphen/>
-      </w:r>
-      <w:r>
-        <w:t xml:space="preserve">100.7(e)⁠(2). Moreover, the tax credit which KAHEAWA erroneously argues constitutes a determination that the wind turbines and towers are not taxable realty is applicable for only one year. That would be the first taxable year the property is purchased or imported into the state, and placed into service.</w:t>
+        <w:t xml:space="preserve">As to HRS § 235-⁠110.7, the provisions apparently relate to any capital goods at the time of purchase and/​or import into the State, a transaction triggering a GET tax obligation. Haw. Rev. Stat. § 235-⁠100.7(e)⁠(2). Moreover, the tax credit which KAHEAWA erroneously argues constitutes a determination that the wind turbines and towers are not taxable realty is applicable for only one year. That would be the first taxable year the property is purchased or imported into the state, and placed into service.</w:t>
       </w:r>
       <w:r>
         <w:t xml:space="preserve"> </w:t>
@@ -9322,13 +9304,7 @@
         <w:t xml:space="preserve"> </w:t>
       </w:r>
       <w:r>
-        <w:t xml:space="preserve">or remotely suggests that once that property is placed in service it might not become an accession to realty as an improvement to the land. In fact, the language from § 235</w:t>
-      </w:r>
-      <w:r>
-        <w:noBreakHyphen/>
-      </w:r>
-      <w:r>
-        <w:t xml:space="preserve">110.7(e), apparently recognizes that</w:t>
+        <w:t xml:space="preserve">or remotely suggests that once that property is placed in service it might not become an accession to realty as an improvement to the land. In fact, the language from § 235-⁠110.7(e), apparently recognizes that</w:t>
       </w:r>
       <w:r>
         <w:t xml:space="preserve"> </w:t>
@@ -10418,6 +10394,33 @@
       <w:ind w:left="2160" w:hanging="720"/>
     </w:pPr>
   </w:style>
+  <w:style w:type="paragraph" w:customStyle="1" w:styleId="XdQuoteList1">
+    <w:name w:val="Xd Quote List 1"/>
+    <w:basedOn w:val="Normal"/>
+    <w:qFormat/>
+    <w:pPr>
+      <w:spacing w:before="0" w:after="0" w:line="276" w:lineRule="exact"/>
+      <w:ind w:left="1440" w:right="720" w:hanging="720"/>
+    </w:pPr>
+  </w:style>
+  <w:style w:type="paragraph" w:customStyle="1" w:styleId="XdQuoteList2">
+    <w:name w:val="Xd Quote List 2"/>
+    <w:basedOn w:val="Normal"/>
+    <w:qFormat/>
+    <w:pPr>
+      <w:spacing w:before="0" w:after="0" w:line="276" w:lineRule="exact"/>
+      <w:ind w:left="2160" w:right="720" w:hanging="720"/>
+    </w:pPr>
+  </w:style>
+  <w:style w:type="paragraph" w:customStyle="1" w:styleId="XdQuoteList3">
+    <w:name w:val="Xd Quote List 3"/>
+    <w:basedOn w:val="Normal"/>
+    <w:qFormat/>
+    <w:pPr>
+      <w:spacing w:before="0" w:after="0" w:line="276" w:lineRule="exact"/>
+      <w:ind w:left="2880" w:right="720" w:hanging="720"/>
+    </w:pPr>
+  </w:style>
   <w:style w:type="paragraph" w:customStyle="1" w:styleId="XdQuoteFirst">
     <w:name w:val="XdQuoteFirst"/>
     <w:basedOn w:val="BodyText"/>

</xml_diff>